<commit_message>
Graph Spec as of nov 5 2024
</commit_message>
<xml_diff>
--- a/2024 10 26 Knowledge Graph Spec.docx
+++ b/2024 10 26 Knowledge Graph Spec.docx
@@ -206,10 +206,7 @@
         </w:numPr>
       </w:pPr>
       <w:r>
-        <w:t>L</w:t>
-      </w:r>
-      <w:r>
-        <w:t>ocation (country, region, city)</w:t>
+        <w:t>Location (country, region, city)</w:t>
       </w:r>
     </w:p>
     <w:p>
@@ -382,6 +379,9 @@
       <w:r>
         <w:t xml:space="preserve"> (all with obvious restrictions), friendship (not necessarily mutual), colleague (mutual, if share place of work), classmate (mutual, if share place of study), fellow __ (mutual, if share profession)</w:t>
       </w:r>
+      <w:r>
+        <w:t>, like, dislike</w:t>
+      </w:r>
     </w:p>
     <w:p>
       <w:pPr>
@@ -407,10 +407,7 @@
         </w:numPr>
       </w:pPr>
       <w:r>
-        <w:t xml:space="preserve">People </w:t>
-      </w:r>
-      <w:r>
-        <w:t>to places</w:t>
+        <w:t>People to places</w:t>
       </w:r>
       <w:r>
         <w:t>:</w:t>
@@ -437,10 +434,7 @@
         </w:numPr>
       </w:pPr>
       <w:r>
-        <w:t xml:space="preserve">People </w:t>
-      </w:r>
-      <w:r>
-        <w:t>to plants</w:t>
+        <w:t>People to plants</w:t>
       </w:r>
       <w:r>
         <w:t xml:space="preserve">: like, dislike,  </w:t>
@@ -455,10 +449,7 @@
         </w:numPr>
       </w:pPr>
       <w:r>
-        <w:t xml:space="preserve">People </w:t>
-      </w:r>
-      <w:r>
-        <w:t>to products</w:t>
+        <w:t>People to products</w:t>
       </w:r>
       <w:r>
         <w:t xml:space="preserve">: like, dislike, allergy, </w:t>
@@ -476,10 +467,7 @@
         </w:numPr>
       </w:pPr>
       <w:r>
-        <w:t xml:space="preserve">People </w:t>
-      </w:r>
-      <w:r>
-        <w:t>to characteristics</w:t>
+        <w:t>People to characteristics</w:t>
       </w:r>
       <w:r>
         <w:t>: membership.</w:t>
@@ -564,6 +552,18 @@
       </w:r>
       <w:r>
         <w:t>: like (within certain restrictions)</w:t>
+      </w:r>
+    </w:p>
+    <w:p>
+      <w:pPr>
+        <w:pStyle w:val="ListParagraph"/>
+        <w:numPr>
+          <w:ilvl w:val="1"/>
+          <w:numId w:val="1"/>
+        </w:numPr>
+      </w:pPr>
+      <w:r>
+        <w:t xml:space="preserve">Pets to products: like, dislike </w:t>
       </w:r>
     </w:p>
     <w:p>

</xml_diff>